<commit_message>
feat: alinear prototipo y documentacion estrictamente con los 7 modulos del MVP (v2.46.0)
</commit_message>
<xml_diff>
--- a/docs/Oficial/BANCO_UNIFICADO_DUDAS_Y_VALIDACIONES_temp_styled.docx
+++ b/docs/Oficial/BANCO_UNIFICADO_DUDAS_Y_VALIDACIONES_temp_styled.docx
@@ -4,14 +4,14 @@
   <w:body>
     <w:p>
       <w:pPr>
-        <w:spacing w:before="240" w:after="80"/>
+        <w:spacing w:before="120" w:after="80"/>
       </w:pPr>
       <w:r>
         <w:rPr>
-          <w:rFonts w:ascii="Arial" w:hAnsi="Arial"/>
+          <w:rFonts w:ascii="Inter" w:hAnsi="Inter"/>
           <w:b/>
-          <w:color w:val="8B5E3C"/>
-          <w:sz w:val="44"/>
+          <w:color w:val="0F172A"/>
+          <w:sz w:val="46"/>
         </w:rPr>
         <w:t>Banco Unificado de Dudas y Validaciones Técnicas</w:t>
       </w:r>
@@ -22,7 +22,7 @@
       </w:pPr>
       <w:r>
         <w:rPr>
-          <w:rFonts w:ascii="Arial" w:hAnsi="Arial"/>
+          <w:rFonts w:ascii="Inter" w:hAnsi="Inter"/>
           <w:b/>
           <w:color w:val="0F172A"/>
           <w:sz w:val="20"/>
@@ -36,10 +36,10 @@
       </w:pPr>
       <w:r>
         <w:rPr>
-          <w:rFonts w:ascii="Arial" w:hAnsi="Arial"/>
+          <w:rFonts w:ascii="Inter" w:hAnsi="Inter"/>
           <w:b w:val="0"/>
           <w:i/>
-          <w:color w:val="1E293B"/>
+          <w:color w:val="334155"/>
           <w:sz w:val="20"/>
         </w:rPr>
         <w:t>Documento Unificado Oficial de Preguntas Clave y Acuerdos Técnicos con el Cliente.</w:t>
@@ -52,22 +52,22 @@
         <w:tblLook w:firstColumn="1" w:firstRow="1" w:lastColumn="0" w:lastRow="0" w:noHBand="0" w:noVBand="1" w:val="04A0"/>
       </w:tblPr>
       <w:tblGrid>
-        <w:gridCol w:w="9360"/>
+        <w:gridCol w:w="9648"/>
       </w:tblGrid>
       <w:tr>
         <w:tc>
           <w:tcPr>
-            <w:tcW w:type="dxa" w:w="9360"/>
+            <w:tcW w:type="dxa" w:w="9648"/>
             <w:shd w:fill="F8FAFC"/>
             <w:tcMar>
-              <w:top w:w="140" w:type="dxa"/>
-              <w:bottom w:w="140" w:type="dxa"/>
-              <w:left w:w="220" w:type="dxa"/>
-              <w:right w:w="220" w:type="dxa"/>
+              <w:top w:w="130" w:type="dxa"/>
+              <w:bottom w:w="130" w:type="dxa"/>
+              <w:left w:w="200" w:type="dxa"/>
+              <w:right w:w="200" w:type="dxa"/>
             </w:tcMar>
             <w:tcBorders>
               <w:top w:val="none"/>
-              <w:left w:val="single" w:sz="24" w:space="0" w:color="8B5E3C"/>
+              <w:left w:val="single" w:sz="24" w:space="0" w:color="2563EB"/>
               <w:bottom w:val="none"/>
               <w:right w:val="none"/>
             </w:tcBorders>
@@ -78,7 +78,7 @@
             </w:pPr>
             <w:r>
               <w:rPr>
-                <w:rFonts w:ascii="Arial" w:hAnsi="Arial"/>
+                <w:rFonts w:ascii="Inter" w:hAnsi="Inter"/>
                 <w:b/>
                 <w:color w:val="0F172A"/>
                 <w:sz w:val="19"/>
@@ -87,9 +87,9 @@
             </w:r>
             <w:r>
               <w:rPr>
-                <w:rFonts w:ascii="Arial" w:hAnsi="Arial"/>
+                <w:rFonts w:ascii="Inter" w:hAnsi="Inter"/>
                 <w:b w:val="0"/>
-                <w:color w:val="1E293B"/>
+                <w:color w:val="334155"/>
                 <w:sz w:val="19"/>
               </w:rPr>
               <w:t xml:space="preserve"> </w:t>
@@ -98,7 +98,7 @@
               <w:rPr>
                 <w:rFonts w:ascii="Consolas" w:hAnsi="Consolas"/>
                 <w:b/>
-                <w:color w:val="8B5E3C"/>
+                <w:color w:val="2563EB"/>
                 <w:sz w:val="18"/>
               </w:rPr>
               <w:t>v2.44.0</w:t>
@@ -108,7 +108,7 @@
             </w:r>
             <w:r>
               <w:rPr>
-                <w:rFonts w:ascii="Arial" w:hAnsi="Arial"/>
+                <w:rFonts w:ascii="Inter" w:hAnsi="Inter"/>
                 <w:b/>
                 <w:color w:val="0F172A"/>
                 <w:sz w:val="19"/>
@@ -117,9 +117,9 @@
             </w:r>
             <w:r>
               <w:rPr>
-                <w:rFonts w:ascii="Arial" w:hAnsi="Arial"/>
+                <w:rFonts w:ascii="Inter" w:hAnsi="Inter"/>
                 <w:b w:val="0"/>
-                <w:color w:val="1E293B"/>
+                <w:color w:val="334155"/>
                 <w:sz w:val="19"/>
               </w:rPr>
               <w:t xml:space="preserve"> 7 de Octubre de 2026</w:t>
@@ -129,7 +129,7 @@
             </w:r>
             <w:r>
               <w:rPr>
-                <w:rFonts w:ascii="Arial" w:hAnsi="Arial"/>
+                <w:rFonts w:ascii="Inter" w:hAnsi="Inter"/>
                 <w:b/>
                 <w:color w:val="0F172A"/>
                 <w:sz w:val="19"/>
@@ -138,9 +138,9 @@
             </w:r>
             <w:r>
               <w:rPr>
-                <w:rFonts w:ascii="Arial" w:hAnsi="Arial"/>
+                <w:rFonts w:ascii="Inter" w:hAnsi="Inter"/>
                 <w:b w:val="0"/>
-                <w:color w:val="1E293B"/>
+                <w:color w:val="334155"/>
                 <w:sz w:val="19"/>
               </w:rPr>
               <w:t xml:space="preserve"> Oficial para Validación Técnica</w:t>
@@ -150,7 +150,7 @@
             </w:r>
             <w:r>
               <w:rPr>
-                <w:rFonts w:ascii="Arial" w:hAnsi="Arial"/>
+                <w:rFonts w:ascii="Inter" w:hAnsi="Inter"/>
                 <w:b/>
                 <w:color w:val="0F172A"/>
                 <w:sz w:val="19"/>
@@ -159,9 +159,9 @@
             </w:r>
             <w:r>
               <w:rPr>
-                <w:rFonts w:ascii="Arial" w:hAnsi="Arial"/>
+                <w:rFonts w:ascii="Inter" w:hAnsi="Inter"/>
                 <w:b w:val="0"/>
-                <w:color w:val="1E293B"/>
+                <w:color w:val="334155"/>
                 <w:sz w:val="19"/>
               </w:rPr>
               <w:t xml:space="preserve"> Tombstone Hats (Edmundo González / Ing. Carlos Ortiz)</w:t>
@@ -171,7 +171,7 @@
             </w:r>
             <w:r>
               <w:rPr>
-                <w:rFonts w:ascii="Arial" w:hAnsi="Arial"/>
+                <w:rFonts w:ascii="Inter" w:hAnsi="Inter"/>
                 <w:b/>
                 <w:color w:val="0F172A"/>
                 <w:sz w:val="19"/>
@@ -180,9 +180,9 @@
             </w:r>
             <w:r>
               <w:rPr>
-                <w:rFonts w:ascii="Arial" w:hAnsi="Arial"/>
+                <w:rFonts w:ascii="Inter" w:hAnsi="Inter"/>
                 <w:b w:val="0"/>
-                <w:color w:val="1E293B"/>
+                <w:color w:val="334155"/>
                 <w:sz w:val="19"/>
               </w:rPr>
               <w:t xml:space="preserve"> Uanify (Andrés Villanueva)</w:t>
@@ -199,12 +199,20 @@
     </w:p>
     <w:p>
       <w:pPr>
+        <w:spacing w:before="80" w:after="160"/>
+        <w:pBdr>
+          <w:bottom w:val="single" w:sz="6" w:space="8" w:color="CBD5E1"/>
+        </w:pBdr>
+      </w:pPr>
+    </w:p>
+    <w:p>
+      <w:pPr>
         <w:keepNext/>
         <w:spacing w:before="320" w:after="80"/>
       </w:pPr>
       <w:r>
         <w:rPr>
-          <w:rFonts w:ascii="Arial" w:hAnsi="Arial"/>
+          <w:rFonts w:ascii="Inter" w:hAnsi="Inter"/>
           <w:b/>
           <w:color w:val="0F172A"/>
           <w:sz w:val="28"/>
@@ -219,9 +227,9 @@
       </w:pPr>
       <w:r>
         <w:rPr>
-          <w:rFonts w:ascii="Arial" w:hAnsi="Arial"/>
+          <w:rFonts w:ascii="Inter" w:hAnsi="Inter"/>
           <w:b/>
-          <w:color w:val="8B5E3C"/>
+          <w:color w:val="2563EB"/>
           <w:sz w:val="23"/>
         </w:rPr>
         <w:t>Hecho Confirmado en Planta:</w:t>
@@ -233,9 +241,9 @@
       </w:pPr>
       <w:r>
         <w:rPr>
-          <w:rFonts w:ascii="Arial" w:hAnsi="Arial"/>
+          <w:rFonts w:ascii="Inter" w:hAnsi="Inter"/>
           <w:b w:val="0"/>
-          <w:color w:val="1E293B"/>
+          <w:color w:val="334155"/>
           <w:sz w:val="20"/>
         </w:rPr>
         <w:t>El lote principal no se detiene cuando se detectan piezas de segunda o defectos menores en línea; las piezas defectuosas se apartan físicamente y el resto de la pila continúa su avance normal por los departamentos.</w:t>
@@ -248,9 +256,9 @@
       </w:pPr>
       <w:r>
         <w:rPr>
-          <w:rFonts w:ascii="Arial" w:hAnsi="Arial"/>
+          <w:rFonts w:ascii="Inter" w:hAnsi="Inter"/>
           <w:b/>
-          <w:color w:val="8B5E3C"/>
+          <w:color w:val="2563EB"/>
           <w:sz w:val="23"/>
         </w:rPr>
         <w:t>Definición Técnica para MVP:</w:t>
@@ -262,16 +270,16 @@
       </w:pPr>
       <w:r>
         <w:rPr>
-          <w:rFonts w:ascii="Arial" w:hAnsi="Arial"/>
+          <w:rFonts w:ascii="Inter" w:hAnsi="Inter"/>
           <w:b w:val="0"/>
-          <w:color w:val="1E293B"/>
+          <w:color w:val="334155"/>
           <w:sz w:val="20"/>
         </w:rPr>
         <w:t xml:space="preserve">El sistema incluye la captura de la cantidad de piezas retiradas, el tipo de afectación (Segunda o Merma), la causa raíz de la falla (poro en lienzo, mancha de acabado, quemadura de vapor, deformación de ala) y la estación donde se detectó. Esta información se almacena como </w:t>
       </w:r>
       <w:r>
         <w:rPr>
-          <w:rFonts w:ascii="Arial" w:hAnsi="Arial"/>
+          <w:rFonts w:ascii="Inter" w:hAnsi="Inter"/>
           <w:b/>
           <w:color w:val="0F172A"/>
           <w:sz w:val="20"/>
@@ -280,9 +288,9 @@
       </w:r>
       <w:r>
         <w:rPr>
-          <w:rFonts w:ascii="Arial" w:hAnsi="Arial"/>
+          <w:rFonts w:ascii="Inter" w:hAnsi="Inter"/>
           <w:b w:val="0"/>
-          <w:color w:val="1E293B"/>
+          <w:color w:val="334155"/>
           <w:sz w:val="20"/>
         </w:rPr>
         <w:t>.</w:t>
@@ -295,9 +303,9 @@
       </w:pPr>
       <w:r>
         <w:rPr>
-          <w:rFonts w:ascii="Arial" w:hAnsi="Arial"/>
+          <w:rFonts w:ascii="Inter" w:hAnsi="Inter"/>
           <w:b/>
-          <w:color w:val="8B5E3C"/>
+          <w:color w:val="2563EB"/>
           <w:sz w:val="23"/>
         </w:rPr>
         <w:t>Puntos por Validar con el Cliente:</w:t>
@@ -310,13 +318,21 @@
       </w:pPr>
       <w:r>
         <w:rPr>
-          <w:rFonts w:ascii="Arial" w:hAnsi="Arial"/>
+          <w:rFonts w:ascii="Inter" w:hAnsi="Inter"/>
           <w:b w:val="0"/>
-          <w:color w:val="1E293B"/>
+          <w:color w:val="334155"/>
           <w:sz w:val="20"/>
         </w:rPr>
         <w:t>¿El registro histórico y conteo para KPIs cubre al 100% la necesidad actual de planta, o requieren que estas piezas descuenten inventario de alguna forma específica en el sistema administrativo más adelante?</w:t>
       </w:r>
+    </w:p>
+    <w:p>
+      <w:pPr>
+        <w:spacing w:before="80" w:after="160"/>
+        <w:pBdr>
+          <w:bottom w:val="single" w:sz="6" w:space="8" w:color="CBD5E1"/>
+        </w:pBdr>
+      </w:pPr>
     </w:p>
     <w:p>
       <w:pPr>
@@ -325,7 +341,7 @@
       </w:pPr>
       <w:r>
         <w:rPr>
-          <w:rFonts w:ascii="Arial" w:hAnsi="Arial"/>
+          <w:rFonts w:ascii="Inter" w:hAnsi="Inter"/>
           <w:b/>
           <w:color w:val="0F172A"/>
           <w:sz w:val="28"/>
@@ -340,9 +356,9 @@
       </w:pPr>
       <w:r>
         <w:rPr>
-          <w:rFonts w:ascii="Arial" w:hAnsi="Arial"/>
+          <w:rFonts w:ascii="Inter" w:hAnsi="Inter"/>
           <w:b/>
-          <w:color w:val="8B5E3C"/>
+          <w:color w:val="2563EB"/>
           <w:sz w:val="23"/>
         </w:rPr>
         <w:t>Hecho Confirmado en Planta:</w:t>
@@ -354,9 +370,9 @@
       </w:pPr>
       <w:r>
         <w:rPr>
-          <w:rFonts w:ascii="Arial" w:hAnsi="Arial"/>
+          <w:rFonts w:ascii="Inter" w:hAnsi="Inter"/>
           <w:b w:val="0"/>
-          <w:color w:val="1E293B"/>
+          <w:color w:val="334155"/>
           <w:sz w:val="20"/>
         </w:rPr>
         <w:t>Existen 4 filtros de inspección en línea atendidos por 6 inspectores exclusivos de calidad.</w:t>
@@ -369,9 +385,9 @@
       </w:pPr>
       <w:r>
         <w:rPr>
-          <w:rFonts w:ascii="Arial" w:hAnsi="Arial"/>
+          <w:rFonts w:ascii="Inter" w:hAnsi="Inter"/>
           <w:b/>
-          <w:color w:val="8B5E3C"/>
+          <w:color w:val="2563EB"/>
           <w:sz w:val="23"/>
         </w:rPr>
         <w:t>Definición Técnica para MVP:</w:t>
@@ -383,16 +399,16 @@
       </w:pPr>
       <w:r>
         <w:rPr>
-          <w:rFonts w:ascii="Arial" w:hAnsi="Arial"/>
+          <w:rFonts w:ascii="Inter" w:hAnsi="Inter"/>
           <w:b w:val="0"/>
-          <w:color w:val="1E293B"/>
+          <w:color w:val="334155"/>
           <w:sz w:val="20"/>
         </w:rPr>
         <w:t xml:space="preserve">En las terminales de los filtros de calidad, el </w:t>
       </w:r>
       <w:r>
         <w:rPr>
-          <w:rFonts w:ascii="Arial" w:hAnsi="Arial"/>
+          <w:rFonts w:ascii="Inter" w:hAnsi="Inter"/>
           <w:b/>
           <w:color w:val="0F172A"/>
           <w:sz w:val="20"/>
@@ -401,16 +417,16 @@
       </w:r>
       <w:r>
         <w:rPr>
-          <w:rFonts w:ascii="Arial" w:hAnsi="Arial"/>
+          <w:rFonts w:ascii="Inter" w:hAnsi="Inter"/>
           <w:b w:val="0"/>
-          <w:color w:val="1E293B"/>
+          <w:color w:val="334155"/>
           <w:sz w:val="20"/>
         </w:rPr>
         <w:t xml:space="preserve"> revisa el lote físico y tiene únicamente dos acciones directas: </w:t>
       </w:r>
       <w:r>
         <w:rPr>
-          <w:rFonts w:ascii="Arial" w:hAnsi="Arial"/>
+          <w:rFonts w:ascii="Inter" w:hAnsi="Inter"/>
           <w:b/>
           <w:color w:val="0F172A"/>
           <w:sz w:val="20"/>
@@ -419,16 +435,16 @@
       </w:r>
       <w:r>
         <w:rPr>
-          <w:rFonts w:ascii="Arial" w:hAnsi="Arial"/>
+          <w:rFonts w:ascii="Inter" w:hAnsi="Inter"/>
           <w:b w:val="0"/>
-          <w:color w:val="1E293B"/>
+          <w:color w:val="334155"/>
           <w:sz w:val="20"/>
         </w:rPr>
         <w:t xml:space="preserve"> (el lote avanza al almacén siguiente) o </w:t>
       </w:r>
       <w:r>
         <w:rPr>
-          <w:rFonts w:ascii="Arial" w:hAnsi="Arial"/>
+          <w:rFonts w:ascii="Inter" w:hAnsi="Inter"/>
           <w:b/>
           <w:color w:val="0F172A"/>
           <w:sz w:val="20"/>
@@ -437,9 +453,9 @@
       </w:r>
       <w:r>
         <w:rPr>
-          <w:rFonts w:ascii="Arial" w:hAnsi="Arial"/>
+          <w:rFonts w:ascii="Inter" w:hAnsi="Inter"/>
           <w:b w:val="0"/>
-          <w:color w:val="1E293B"/>
+          <w:color w:val="334155"/>
           <w:sz w:val="20"/>
         </w:rPr>
         <w:t xml:space="preserve"> (se abre el flujo de resolución de no conformidad).</w:t>
@@ -452,9 +468,9 @@
       </w:pPr>
       <w:r>
         <w:rPr>
-          <w:rFonts w:ascii="Arial" w:hAnsi="Arial"/>
+          <w:rFonts w:ascii="Inter" w:hAnsi="Inter"/>
           <w:b/>
-          <w:color w:val="8B5E3C"/>
+          <w:color w:val="2563EB"/>
           <w:sz w:val="23"/>
         </w:rPr>
         <w:t>Puntos por Validar con el Cliente:</w:t>
@@ -467,9 +483,9 @@
       </w:pPr>
       <w:r>
         <w:rPr>
-          <w:rFonts w:ascii="Arial" w:hAnsi="Arial"/>
+          <w:rFonts w:ascii="Inter" w:hAnsi="Inter"/>
           <w:b w:val="0"/>
-          <w:color w:val="1E293B"/>
+          <w:color w:val="334155"/>
           <w:sz w:val="20"/>
         </w:rPr>
         <w:t>Cuando un inspector rechaza un lote, ¿quién debe tener la facultad en la aplicación para dictaminar hacia dónde se dirige (Reproceso a estación anterior seleccionada, Segunda o Merma)?</w:t>
@@ -482,16 +498,16 @@
       </w:pPr>
       <w:r>
         <w:rPr>
-          <w:rFonts w:ascii="Arial" w:hAnsi="Arial"/>
+          <w:rFonts w:ascii="Inter" w:hAnsi="Inter"/>
           <w:b w:val="0"/>
-          <w:color w:val="1E293B"/>
+          <w:color w:val="334155"/>
           <w:sz w:val="20"/>
         </w:rPr>
         <w:t xml:space="preserve">Opción 1: Exclusivamente el </w:t>
       </w:r>
       <w:r>
         <w:rPr>
-          <w:rFonts w:ascii="Arial" w:hAnsi="Arial"/>
+          <w:rFonts w:ascii="Inter" w:hAnsi="Inter"/>
           <w:b/>
           <w:color w:val="0F172A"/>
           <w:sz w:val="20"/>
@@ -500,9 +516,9 @@
       </w:r>
       <w:r>
         <w:rPr>
-          <w:rFonts w:ascii="Arial" w:hAnsi="Arial"/>
+          <w:rFonts w:ascii="Inter" w:hAnsi="Inter"/>
           <w:b w:val="0"/>
-          <w:color w:val="1E293B"/>
+          <w:color w:val="334155"/>
           <w:sz w:val="20"/>
         </w:rPr>
         <w:t>.</w:t>
@@ -515,16 +531,16 @@
       </w:pPr>
       <w:r>
         <w:rPr>
-          <w:rFonts w:ascii="Arial" w:hAnsi="Arial"/>
+          <w:rFonts w:ascii="Inter" w:hAnsi="Inter"/>
           <w:b w:val="0"/>
-          <w:color w:val="1E293B"/>
+          <w:color w:val="334155"/>
           <w:sz w:val="20"/>
         </w:rPr>
         <w:t xml:space="preserve">Opción 2: El </w:t>
       </w:r>
       <w:r>
         <w:rPr>
-          <w:rFonts w:ascii="Arial" w:hAnsi="Arial"/>
+          <w:rFonts w:ascii="Inter" w:hAnsi="Inter"/>
           <w:b/>
           <w:color w:val="0F172A"/>
           <w:sz w:val="20"/>
@@ -533,9 +549,9 @@
       </w:r>
       <w:r>
         <w:rPr>
-          <w:rFonts w:ascii="Arial" w:hAnsi="Arial"/>
+          <w:rFonts w:ascii="Inter" w:hAnsi="Inter"/>
           <w:b w:val="0"/>
-          <w:color w:val="1E293B"/>
+          <w:color w:val="334155"/>
           <w:sz w:val="20"/>
         </w:rPr>
         <w:t>.</w:t>
@@ -548,9 +564,9 @@
       </w:pPr>
       <w:r>
         <w:rPr>
-          <w:rFonts w:ascii="Arial" w:hAnsi="Arial"/>
+          <w:rFonts w:ascii="Inter" w:hAnsi="Inter"/>
           <w:b w:val="0"/>
-          <w:color w:val="1E293B"/>
+          <w:color w:val="334155"/>
           <w:sz w:val="20"/>
         </w:rPr>
         <w:t>Opción 3: Cualquiera de los dos (indistintamente quien se encuentre en piso).</w:t>
@@ -563,16 +579,16 @@
       </w:pPr>
       <w:r>
         <w:rPr>
-          <w:rFonts w:ascii="Arial" w:hAnsi="Arial"/>
+          <w:rFonts w:ascii="Inter" w:hAnsi="Inter"/>
           <w:b w:val="0"/>
-          <w:color w:val="1E293B"/>
+          <w:color w:val="334155"/>
           <w:sz w:val="20"/>
         </w:rPr>
         <w:t xml:space="preserve">En el caso de </w:t>
       </w:r>
       <w:r>
         <w:rPr>
-          <w:rFonts w:ascii="Arial" w:hAnsi="Arial"/>
+          <w:rFonts w:ascii="Inter" w:hAnsi="Inter"/>
           <w:b/>
           <w:color w:val="0F172A"/>
           <w:sz w:val="20"/>
@@ -581,23 +597,31 @@
       </w:r>
       <w:r>
         <w:rPr>
-          <w:rFonts w:ascii="Arial" w:hAnsi="Arial"/>
+          <w:rFonts w:ascii="Inter" w:hAnsi="Inter"/>
           <w:b w:val="0"/>
-          <w:color w:val="1E293B"/>
+          <w:color w:val="334155"/>
           <w:sz w:val="20"/>
         </w:rPr>
         <w:t xml:space="preserve">: ¿El sistema debe permitir seleccionar libremente cualquier departamento anterior de la ruta, o solo el departamento inmediatamente previo? </w:t>
       </w:r>
       <w:r>
         <w:rPr>
-          <w:rFonts w:ascii="Arial" w:hAnsi="Arial"/>
+          <w:rFonts w:ascii="Inter" w:hAnsi="Inter"/>
           <w:b w:val="0"/>
           <w:i/>
-          <w:color w:val="1E293B"/>
+          <w:color w:val="334155"/>
           <w:sz w:val="20"/>
         </w:rPr>
         <w:t>(Recomendación: permitir seleccionar libremente el departamento que causó el defecto).</w:t>
       </w:r>
+    </w:p>
+    <w:p>
+      <w:pPr>
+        <w:spacing w:before="80" w:after="160"/>
+        <w:pBdr>
+          <w:bottom w:val="single" w:sz="6" w:space="8" w:color="CBD5E1"/>
+        </w:pBdr>
+      </w:pPr>
     </w:p>
     <w:p>
       <w:pPr>
@@ -606,7 +630,7 @@
       </w:pPr>
       <w:r>
         <w:rPr>
-          <w:rFonts w:ascii="Arial" w:hAnsi="Arial"/>
+          <w:rFonts w:ascii="Inter" w:hAnsi="Inter"/>
           <w:b/>
           <w:color w:val="0F172A"/>
           <w:sz w:val="28"/>
@@ -621,9 +645,9 @@
       </w:pPr>
       <w:r>
         <w:rPr>
-          <w:rFonts w:ascii="Arial" w:hAnsi="Arial"/>
+          <w:rFonts w:ascii="Inter" w:hAnsi="Inter"/>
           <w:b/>
-          <w:color w:val="8B5E3C"/>
+          <w:color w:val="2563EB"/>
           <w:sz w:val="23"/>
         </w:rPr>
         <w:t>Hecho Confirmado en Planta:</w:t>
@@ -635,9 +659,9 @@
       </w:pPr>
       <w:r>
         <w:rPr>
-          <w:rFonts w:ascii="Arial" w:hAnsi="Arial"/>
+          <w:rFonts w:ascii="Inter" w:hAnsi="Inter"/>
           <w:b w:val="0"/>
-          <w:color w:val="1E293B"/>
+          <w:color w:val="334155"/>
           <w:sz w:val="20"/>
         </w:rPr>
         <w:t>Actualmente los paros no se digitalizan; cuando ocurre una falla se avisa verbalmente al mecánico de mantenimiento. En Prensas (cuello de botella) se requiere registrar los paros de inicio a fin.</w:t>
@@ -650,9 +674,9 @@
       </w:pPr>
       <w:r>
         <w:rPr>
-          <w:rFonts w:ascii="Arial" w:hAnsi="Arial"/>
+          <w:rFonts w:ascii="Inter" w:hAnsi="Inter"/>
           <w:b/>
-          <w:color w:val="8B5E3C"/>
+          <w:color w:val="2563EB"/>
           <w:sz w:val="23"/>
         </w:rPr>
         <w:t>Definición Técnica para MVP:</w:t>
@@ -664,9 +688,9 @@
       </w:pPr>
       <w:r>
         <w:rPr>
-          <w:rFonts w:ascii="Arial" w:hAnsi="Arial"/>
+          <w:rFonts w:ascii="Inter" w:hAnsi="Inter"/>
           <w:b w:val="0"/>
-          <w:color w:val="1E293B"/>
+          <w:color w:val="334155"/>
           <w:sz w:val="20"/>
         </w:rPr>
         <w:t>La terminal de piso contará con un módulo táctil rápido para registrar eventos improductivos indicando: Estación/Máquina, Operador en turno, Hora de inicio, Hora de fin y Motivo de detención.</w:t>
@@ -679,9 +703,9 @@
       </w:pPr>
       <w:r>
         <w:rPr>
-          <w:rFonts w:ascii="Arial" w:hAnsi="Arial"/>
+          <w:rFonts w:ascii="Inter" w:hAnsi="Inter"/>
           <w:b/>
-          <w:color w:val="8B5E3C"/>
+          <w:color w:val="2563EB"/>
           <w:sz w:val="23"/>
         </w:rPr>
         <w:t>Puntos por Validar con el Cliente:</w:t>
@@ -694,7 +718,7 @@
       </w:pPr>
       <w:r>
         <w:rPr>
-          <w:rFonts w:ascii="Arial" w:hAnsi="Arial"/>
+          <w:rFonts w:ascii="Inter" w:hAnsi="Inter"/>
           <w:b/>
           <w:color w:val="0F172A"/>
           <w:sz w:val="20"/>
@@ -703,9 +727,9 @@
       </w:r>
       <w:r>
         <w:rPr>
-          <w:rFonts w:ascii="Arial" w:hAnsi="Arial"/>
+          <w:rFonts w:ascii="Inter" w:hAnsi="Inter"/>
           <w:b w:val="0"/>
-          <w:color w:val="1E293B"/>
+          <w:color w:val="334155"/>
           <w:sz w:val="20"/>
         </w:rPr>
         <w:t xml:space="preserve"> ¿A partir de cuántos minutos de detención se debe exigir el registro de un paro (ej. eventos mayores a 5 minutos, o registrar cualquier pausa)?</w:t>
@@ -718,7 +742,7 @@
       </w:pPr>
       <w:r>
         <w:rPr>
-          <w:rFonts w:ascii="Arial" w:hAnsi="Arial"/>
+          <w:rFonts w:ascii="Inter" w:hAnsi="Inter"/>
           <w:b/>
           <w:color w:val="0F172A"/>
           <w:sz w:val="20"/>
@@ -727,32 +751,40 @@
       </w:r>
       <w:r>
         <w:rPr>
-          <w:rFonts w:ascii="Arial" w:hAnsi="Arial"/>
+          <w:rFonts w:ascii="Inter" w:hAnsi="Inter"/>
           <w:b w:val="0"/>
-          <w:color w:val="1E293B"/>
+          <w:color w:val="334155"/>
           <w:sz w:val="20"/>
         </w:rPr>
         <w:t xml:space="preserve"> Se propone un catálogo base táctil con: </w:t>
       </w:r>
       <w:r>
         <w:rPr>
-          <w:rFonts w:ascii="Arial" w:hAnsi="Arial"/>
+          <w:rFonts w:ascii="Inter" w:hAnsi="Inter"/>
           <w:b w:val="0"/>
           <w:i/>
-          <w:color w:val="1E293B"/>
+          <w:color w:val="334155"/>
           <w:sz w:val="20"/>
         </w:rPr>
         <w:t>Cambio de horma / molde, Falla mecánica de prensa, Falta de vapor en caldera, Falta de material / lienzos, Mantenimiento eléctrico</w:t>
       </w:r>
       <w:r>
         <w:rPr>
-          <w:rFonts w:ascii="Arial" w:hAnsi="Arial"/>
+          <w:rFonts w:ascii="Inter" w:hAnsi="Inter"/>
           <w:b w:val="0"/>
-          <w:color w:val="1E293B"/>
+          <w:color w:val="334155"/>
           <w:sz w:val="20"/>
         </w:rPr>
         <w:t>. ¿Desean agregar o acotar motivos específicos para su nave?</w:t>
       </w:r>
+    </w:p>
+    <w:p>
+      <w:pPr>
+        <w:spacing w:before="80" w:after="160"/>
+        <w:pBdr>
+          <w:bottom w:val="single" w:sz="6" w:space="8" w:color="CBD5E1"/>
+        </w:pBdr>
+      </w:pPr>
     </w:p>
     <w:p>
       <w:pPr>
@@ -761,7 +793,7 @@
       </w:pPr>
       <w:r>
         <w:rPr>
-          <w:rFonts w:ascii="Arial" w:hAnsi="Arial"/>
+          <w:rFonts w:ascii="Inter" w:hAnsi="Inter"/>
           <w:b/>
           <w:color w:val="0F172A"/>
           <w:sz w:val="28"/>
@@ -776,9 +808,9 @@
       </w:pPr>
       <w:r>
         <w:rPr>
-          <w:rFonts w:ascii="Arial" w:hAnsi="Arial"/>
+          <w:rFonts w:ascii="Inter" w:hAnsi="Inter"/>
           <w:b/>
-          <w:color w:val="8B5E3C"/>
+          <w:color w:val="2563EB"/>
           <w:sz w:val="23"/>
         </w:rPr>
         <w:t>Hecho Confirmado en Planta:</w:t>
@@ -790,9 +822,9 @@
       </w:pPr>
       <w:r>
         <w:rPr>
-          <w:rFonts w:ascii="Arial" w:hAnsi="Arial"/>
+          <w:rFonts w:ascii="Inter" w:hAnsi="Inter"/>
           <w:b w:val="0"/>
-          <w:color w:val="1E293B"/>
+          <w:color w:val="334155"/>
           <w:sz w:val="20"/>
         </w:rPr>
         <w:t>Las órdenes provienen de CONTPAQi Comercial. La partición de lotes y las tarjetas viajeras hoy se gestionan con formatos en hoja carta de oficina que se recortan e insertan en fundas plásticas cosidas.</w:t>
@@ -805,9 +837,9 @@
       </w:pPr>
       <w:r>
         <w:rPr>
-          <w:rFonts w:ascii="Arial" w:hAnsi="Arial"/>
+          <w:rFonts w:ascii="Inter" w:hAnsi="Inter"/>
           <w:b/>
-          <w:color w:val="8B5E3C"/>
+          <w:color w:val="2563EB"/>
           <w:sz w:val="23"/>
         </w:rPr>
         <w:t>Definición Técnica para MVP:</w:t>
@@ -819,16 +851,16 @@
       </w:pPr>
       <w:r>
         <w:rPr>
-          <w:rFonts w:ascii="Arial" w:hAnsi="Arial"/>
+          <w:rFonts w:ascii="Inter" w:hAnsi="Inter"/>
           <w:b w:val="0"/>
-          <w:color w:val="1E293B"/>
+          <w:color w:val="334155"/>
           <w:sz w:val="20"/>
         </w:rPr>
         <w:t xml:space="preserve">El Ingeniero Admin consulta las órdenes directamente en el MES desde la base de datos SQL Server de CONTPAQi. Define manualmente la partición de lotes madre (base 60 piezas) y sublotes (15 piezas), y </w:t>
       </w:r>
       <w:r>
         <w:rPr>
-          <w:rFonts w:ascii="Arial" w:hAnsi="Arial"/>
+          <w:rFonts w:ascii="Inter" w:hAnsi="Inter"/>
           <w:b/>
           <w:color w:val="0F172A"/>
           <w:sz w:val="20"/>
@@ -837,9 +869,9 @@
       </w:r>
       <w:r>
         <w:rPr>
-          <w:rFonts w:ascii="Arial" w:hAnsi="Arial"/>
+          <w:rFonts w:ascii="Inter" w:hAnsi="Inter"/>
           <w:b w:val="0"/>
-          <w:color w:val="1E293B"/>
+          <w:color w:val="334155"/>
           <w:sz w:val="20"/>
         </w:rPr>
         <w:t xml:space="preserve"> en hojas tamaño carta estándar para recortar.</w:t>
@@ -852,9 +884,9 @@
       </w:pPr>
       <w:r>
         <w:rPr>
-          <w:rFonts w:ascii="Arial" w:hAnsi="Arial"/>
+          <w:rFonts w:ascii="Inter" w:hAnsi="Inter"/>
           <w:b/>
-          <w:color w:val="8B5E3C"/>
+          <w:color w:val="2563EB"/>
           <w:sz w:val="23"/>
         </w:rPr>
         <w:t>Puntos por Validar con el Cliente:</w:t>
@@ -867,7 +899,7 @@
       </w:pPr>
       <w:r>
         <w:rPr>
-          <w:rFonts w:ascii="Arial" w:hAnsi="Arial"/>
+          <w:rFonts w:ascii="Inter" w:hAnsi="Inter"/>
           <w:b/>
           <w:color w:val="0F172A"/>
           <w:sz w:val="20"/>
@@ -876,9 +908,9 @@
       </w:r>
       <w:r>
         <w:rPr>
-          <w:rFonts w:ascii="Arial" w:hAnsi="Arial"/>
+          <w:rFonts w:ascii="Inter" w:hAnsi="Inter"/>
           <w:b w:val="0"/>
-          <w:color w:val="1E293B"/>
+          <w:color w:val="334155"/>
           <w:sz w:val="20"/>
         </w:rPr>
         <w:t xml:space="preserve"> ¿Cuáles son las dimensiones físicas en centímetros de las fundas plásticas que utilizan actualmente en planta para calibrar los márgenes de impresión y que encajen sin problema?</w:t>
@@ -891,7 +923,7 @@
       </w:pPr>
       <w:r>
         <w:rPr>
-          <w:rFonts w:ascii="Arial" w:hAnsi="Arial"/>
+          <w:rFonts w:ascii="Inter" w:hAnsi="Inter"/>
           <w:b/>
           <w:color w:val="0F172A"/>
           <w:sz w:val="20"/>
@@ -900,13 +932,21 @@
       </w:r>
       <w:r>
         <w:rPr>
-          <w:rFonts w:ascii="Arial" w:hAnsi="Arial"/>
+          <w:rFonts w:ascii="Inter" w:hAnsi="Inter"/>
           <w:b w:val="0"/>
-          <w:color w:val="1E293B"/>
+          <w:color w:val="334155"/>
           <w:sz w:val="20"/>
         </w:rPr>
         <w:t xml:space="preserve"> Se propone imprimir: Folio de Lote / Sublote, Código QR de alta densidad, Modelo de sombrero, Talla, Horma asignada, Orden de producción y Fecha. ¿Requieren algún dato adicional visible en la mica?</w:t>
       </w:r>
+    </w:p>
+    <w:p>
+      <w:pPr>
+        <w:spacing w:before="80" w:after="160"/>
+        <w:pBdr>
+          <w:bottom w:val="single" w:sz="6" w:space="8" w:color="CBD5E1"/>
+        </w:pBdr>
+      </w:pPr>
     </w:p>
     <w:p>
       <w:pPr>
@@ -915,7 +955,7 @@
       </w:pPr>
       <w:r>
         <w:rPr>
-          <w:rFonts w:ascii="Arial" w:hAnsi="Arial"/>
+          <w:rFonts w:ascii="Inter" w:hAnsi="Inter"/>
           <w:b/>
           <w:color w:val="0F172A"/>
           <w:sz w:val="28"/>
@@ -930,9 +970,9 @@
       </w:pPr>
       <w:r>
         <w:rPr>
-          <w:rFonts w:ascii="Arial" w:hAnsi="Arial"/>
+          <w:rFonts w:ascii="Inter" w:hAnsi="Inter"/>
           <w:b/>
-          <w:color w:val="8B5E3C"/>
+          <w:color w:val="2563EB"/>
           <w:sz w:val="23"/>
         </w:rPr>
         <w:t>Hecho Confirmado en Planta:</w:t>
@@ -944,9 +984,9 @@
       </w:pPr>
       <w:r>
         <w:rPr>
-          <w:rFonts w:ascii="Arial" w:hAnsi="Arial"/>
+          <w:rFonts w:ascii="Inter" w:hAnsi="Inter"/>
           <w:b w:val="0"/>
-          <w:color w:val="1E293B"/>
+          <w:color w:val="334155"/>
           <w:sz w:val="20"/>
         </w:rPr>
         <w:t>Las 6 terminales táctiles estarán ubicadas en puntos fijos de la nave y serán compartidas entre supervisores e inspectores que rotan por las áreas de trabajo.</w:t>
@@ -959,9 +999,9 @@
       </w:pPr>
       <w:r>
         <w:rPr>
-          <w:rFonts w:ascii="Arial" w:hAnsi="Arial"/>
+          <w:rFonts w:ascii="Inter" w:hAnsi="Inter"/>
           <w:b/>
-          <w:color w:val="8B5E3C"/>
+          <w:color w:val="2563EB"/>
           <w:sz w:val="23"/>
         </w:rPr>
         <w:t>Definición Técnica para MVP:</w:t>
@@ -973,9 +1013,9 @@
       </w:pPr>
       <w:r>
         <w:rPr>
-          <w:rFonts w:ascii="Arial" w:hAnsi="Arial"/>
+          <w:rFonts w:ascii="Inter" w:hAnsi="Inter"/>
           <w:b w:val="0"/>
-          <w:color w:val="1E293B"/>
+          <w:color w:val="334155"/>
           <w:sz w:val="20"/>
         </w:rPr>
         <w:t>El sistema cuenta con 3 perfiles de acceso bien diferenciados:</w:t>
@@ -988,7 +1028,7 @@
       </w:pPr>
       <w:r>
         <w:rPr>
-          <w:rFonts w:ascii="Arial" w:hAnsi="Arial"/>
+          <w:rFonts w:ascii="Inter" w:hAnsi="Inter"/>
           <w:b/>
           <w:color w:val="0F172A"/>
           <w:sz w:val="20"/>
@@ -997,9 +1037,9 @@
       </w:r>
       <w:r>
         <w:rPr>
-          <w:rFonts w:ascii="Arial" w:hAnsi="Arial"/>
+          <w:rFonts w:ascii="Inter" w:hAnsi="Inter"/>
           <w:b w:val="0"/>
-          <w:color w:val="1E293B"/>
+          <w:color w:val="334155"/>
           <w:sz w:val="20"/>
         </w:rPr>
         <w:t xml:space="preserve"> (Acceso total a catálogos, enlace CONTPAQi, creación de lotes e impresión).</w:t>
@@ -1012,7 +1052,7 @@
       </w:pPr>
       <w:r>
         <w:rPr>
-          <w:rFonts w:ascii="Arial" w:hAnsi="Arial"/>
+          <w:rFonts w:ascii="Inter" w:hAnsi="Inter"/>
           <w:b/>
           <w:color w:val="0F172A"/>
           <w:sz w:val="20"/>
@@ -1021,9 +1061,9 @@
       </w:r>
       <w:r>
         <w:rPr>
-          <w:rFonts w:ascii="Arial" w:hAnsi="Arial"/>
+          <w:rFonts w:ascii="Inter" w:hAnsi="Inter"/>
           <w:b w:val="0"/>
-          <w:color w:val="1E293B"/>
+          <w:color w:val="334155"/>
           <w:sz w:val="20"/>
         </w:rPr>
         <w:t xml:space="preserve"> (Consulta de WIP de sus almacenes, depósito de lotes, Modo Rampa y paros).</w:t>
@@ -1036,7 +1076,7 @@
       </w:pPr>
       <w:r>
         <w:rPr>
-          <w:rFonts w:ascii="Arial" w:hAnsi="Arial"/>
+          <w:rFonts w:ascii="Inter" w:hAnsi="Inter"/>
           <w:b/>
           <w:color w:val="0F172A"/>
           <w:sz w:val="20"/>
@@ -1045,9 +1085,9 @@
       </w:r>
       <w:r>
         <w:rPr>
-          <w:rFonts w:ascii="Arial" w:hAnsi="Arial"/>
+          <w:rFonts w:ascii="Inter" w:hAnsi="Inter"/>
           <w:b w:val="0"/>
-          <w:color w:val="1E293B"/>
+          <w:color w:val="334155"/>
           <w:sz w:val="20"/>
         </w:rPr>
         <w:t xml:space="preserve"> (Validación de filtros de calidad).</w:t>
@@ -1060,9 +1100,9 @@
       </w:pPr>
       <w:r>
         <w:rPr>
-          <w:rFonts w:ascii="Arial" w:hAnsi="Arial"/>
+          <w:rFonts w:ascii="Inter" w:hAnsi="Inter"/>
           <w:b/>
-          <w:color w:val="8B5E3C"/>
+          <w:color w:val="2563EB"/>
           <w:sz w:val="23"/>
         </w:rPr>
         <w:t>Puntos por Validar con el Cliente:</w:t>
@@ -1075,9 +1115,9 @@
       </w:pPr>
       <w:r>
         <w:rPr>
-          <w:rFonts w:ascii="Arial" w:hAnsi="Arial"/>
+          <w:rFonts w:ascii="Inter" w:hAnsi="Inter"/>
           <w:b w:val="0"/>
-          <w:color w:val="1E293B"/>
+          <w:color w:val="334155"/>
           <w:sz w:val="20"/>
         </w:rPr>
         <w:t>Para garantizar rapidez y ergonomía en las pantallas táctiles compartidas, ¿prefieren:</w:t>
@@ -1090,7 +1130,7 @@
       </w:pPr>
       <w:r>
         <w:rPr>
-          <w:rFonts w:ascii="Arial" w:hAnsi="Arial"/>
+          <w:rFonts w:ascii="Inter" w:hAnsi="Inter"/>
           <w:b/>
           <w:color w:val="0F172A"/>
           <w:sz w:val="20"/>
@@ -1099,9 +1139,9 @@
       </w:r>
       <w:r>
         <w:rPr>
-          <w:rFonts w:ascii="Arial" w:hAnsi="Arial"/>
+          <w:rFonts w:ascii="Inter" w:hAnsi="Inter"/>
           <w:b w:val="0"/>
-          <w:color w:val="1E293B"/>
+          <w:color w:val="334155"/>
           <w:sz w:val="20"/>
         </w:rPr>
         <w:t xml:space="preserve"> por usuario con teclado táctil en pantalla (sin necesidad de escribir contraseñas largas con guantes o dedos ocupados)?</w:t>
@@ -1114,16 +1154,16 @@
       </w:pPr>
       <w:r>
         <w:rPr>
-          <w:rFonts w:ascii="Arial" w:hAnsi="Arial"/>
+          <w:rFonts w:ascii="Inter" w:hAnsi="Inter"/>
           <w:b w:val="0"/>
-          <w:color w:val="1E293B"/>
+          <w:color w:val="334155"/>
           <w:sz w:val="20"/>
         </w:rPr>
         <w:t xml:space="preserve">O </w:t>
       </w:r>
       <w:r>
         <w:rPr>
-          <w:rFonts w:ascii="Arial" w:hAnsi="Arial"/>
+          <w:rFonts w:ascii="Inter" w:hAnsi="Inter"/>
           <w:b/>
           <w:color w:val="0F172A"/>
           <w:sz w:val="20"/>
@@ -1132,18 +1172,19 @@
       </w:r>
       <w:r>
         <w:rPr>
-          <w:rFonts w:ascii="Arial" w:hAnsi="Arial"/>
+          <w:rFonts w:ascii="Inter" w:hAnsi="Inter"/>
           <w:b w:val="0"/>
-          <w:color w:val="1E293B"/>
+          <w:color w:val="334155"/>
           <w:sz w:val="20"/>
         </w:rPr>
         <w:t xml:space="preserve"> alfanumérica?</w:t>
       </w:r>
     </w:p>
     <w:sectPr>
-      <w:footerReference w:type="default" r:id="rId9"/>
+      <w:headerReference w:type="default" r:id="rId9"/>
+      <w:footerReference w:type="default" r:id="rId10"/>
       <w:pgSz w:w="12240" w:h="15840"/>
-      <w:pgMar w:top="1440" w:right="1440" w:bottom="1440" w:left="1440" w:header="720" w:footer="720" w:gutter="0"/>
+      <w:pgMar w:top="1224" w:right="1296" w:bottom="1224" w:left="1296" w:header="720" w:footer="720" w:gutter="0"/>
       <w:cols w:space="720"/>
       <w:docGrid w:linePitch="360"/>
     </w:sectPr>
@@ -1160,14 +1201,25 @@
     </w:pPr>
     <w:r>
       <w:rPr>
-        <w:rFonts w:ascii="Arial" w:hAnsi="Arial"/>
+        <w:rFonts w:ascii="Inter" w:hAnsi="Inter"/>
         <w:color w:val="64748B"/>
         <w:sz w:val="17"/>
       </w:rPr>
-      <w:t>Tombstone Hats MES · Uanify Software Industrial  |  Banco Unificado de Dudas y Validaciones Tecnicas</w:t>
+      <w:t>Tombstone Hats MES · Uanify Software Industrial  |  Banco Unificado de Dudas y Validaciones Técnicas</w:t>
     </w:r>
   </w:p>
 </w:ftr>
+</file>
+
+<file path=word/header1.xml><?xml version="1.0" encoding="utf-8"?>
+<w:hdr xmlns:m="http://schemas.openxmlformats.org/officeDocument/2006/math" xmlns:mc="http://schemas.openxmlformats.org/markup-compatibility/2006" xmlns:mo="http://schemas.microsoft.com/office/mac/office/2008/main" xmlns:mv="urn:schemas-microsoft-com:mac:vml" xmlns:o="urn:schemas-microsoft-com:office:office" xmlns:r="http://schemas.openxmlformats.org/officeDocument/2006/relationships" xmlns:v="urn:schemas-microsoft-com:vml" xmlns:w10="urn:schemas-microsoft-com:office:word" xmlns:w14="http://schemas.microsoft.com/office/word/2010/wordml" xmlns:w="http://schemas.openxmlformats.org/wordprocessingml/2006/main" xmlns:wne="http://schemas.microsoft.com/office/word/2006/wordml" xmlns:wp14="http://schemas.microsoft.com/office/word/2010/wordprocessingDrawing" xmlns:wp="http://schemas.openxmlformats.org/drawingml/2006/wordprocessingDrawing" xmlns:wpc="http://schemas.microsoft.com/office/word/2010/wordprocessingCanvas" xmlns:wpg="http://schemas.microsoft.com/office/word/2010/wordprocessingGroup" xmlns:wpi="http://schemas.microsoft.com/office/word/2010/wordprocessingInk" xmlns:wps="http://schemas.microsoft.com/office/word/2010/wordprocessingShape" mc:Ignorable="w14 wp14">
+  <w:p>
+    <w:pPr>
+      <w:pStyle w:val="Header"/>
+    </w:pPr>
+    <w:r/>
+  </w:p>
+</w:hdr>
 </file>
 
 <file path=word/numbering.xml><?xml version="1.0" encoding="utf-8"?>

</xml_diff>